<commit_message>
1.17.1: līgums — centrēti lauki dokumenta fontā, paraksta datums, obligāts pārstāvja statuss, jautājums par līguma nr., dati kartītē
Co-Authored-By: Claude Opus 5.5 <noreply@anthropic.com>
Claude-Session: https://claude.ai/code/session_01JTs5K6LLDqUnFLQQi1FdF5
</commit_message>
<xml_diff>
--- a/vendor/templates/ligums-jaunietis-edoc.docx
+++ b/vendor/templates/ligums-jaunietis-edoc.docx
@@ -408,6 +408,7 @@
             <w:pPr>
               <w:suppressAutoHyphens/>
               <w:ind w:left="-108" w:right="-108"/>
+              <w:jc w:val="center"/>
               <w:rPr>
                 <w:rFonts w:eastAsia="Times New Roman"/>
                 <w:sz w:val="25"/>
@@ -416,6 +417,12 @@
               </w:rPr>
             </w:pPr>
             <w:r>
+              <w:rPr>
+                <w:rFonts w:ascii="Times New Roman" w:hAnsi="Times New Roman" w:cs="Times New Roman" w:eastAsia="Times New Roman"/>
+                <w:b w:val="0"/>
+                <w:i w:val="0"/>
+                <w:sz w:val="25"/>
+              </w:rPr>
               <w:t>{j_statuss_vards}</w:t>
             </w:r>
           </w:p>
@@ -464,6 +471,12 @@
               </w:rPr>
             </w:pPr>
             <w:r>
+              <w:rPr>
+                <w:rFonts w:ascii="Times New Roman" w:hAnsi="Times New Roman" w:cs="Times New Roman" w:eastAsia="Times New Roman"/>
+                <w:b w:val="0"/>
+                <w:i w:val="0"/>
+                <w:sz w:val="25"/>
+              </w:rPr>
               <w:t>{j_pk1}</w:t>
             </w:r>
           </w:p>
@@ -492,6 +505,12 @@
               </w:rPr>
             </w:pPr>
             <w:r>
+              <w:rPr>
+                <w:rFonts w:ascii="Times New Roman" w:hAnsi="Times New Roman" w:cs="Times New Roman" w:eastAsia="Times New Roman"/>
+                <w:b w:val="0"/>
+                <w:i w:val="0"/>
+                <w:sz w:val="25"/>
+              </w:rPr>
               <w:t>{j_pk2}</w:t>
             </w:r>
           </w:p>
@@ -520,6 +539,12 @@
               </w:rPr>
             </w:pPr>
             <w:r>
+              <w:rPr>
+                <w:rFonts w:ascii="Times New Roman" w:hAnsi="Times New Roman" w:cs="Times New Roman" w:eastAsia="Times New Roman"/>
+                <w:b w:val="0"/>
+                <w:i w:val="0"/>
+                <w:sz w:val="25"/>
+              </w:rPr>
               <w:t>{j_pk3}</w:t>
             </w:r>
           </w:p>
@@ -548,6 +573,12 @@
               </w:rPr>
             </w:pPr>
             <w:r>
+              <w:rPr>
+                <w:rFonts w:ascii="Times New Roman" w:hAnsi="Times New Roman" w:cs="Times New Roman" w:eastAsia="Times New Roman"/>
+                <w:b w:val="0"/>
+                <w:i w:val="0"/>
+                <w:sz w:val="25"/>
+              </w:rPr>
               <w:t>{j_pk4}</w:t>
             </w:r>
           </w:p>
@@ -576,6 +607,12 @@
               </w:rPr>
             </w:pPr>
             <w:r>
+              <w:rPr>
+                <w:rFonts w:ascii="Times New Roman" w:hAnsi="Times New Roman" w:cs="Times New Roman" w:eastAsia="Times New Roman"/>
+                <w:b w:val="0"/>
+                <w:i w:val="0"/>
+                <w:sz w:val="25"/>
+              </w:rPr>
               <w:t>{j_pk5}</w:t>
             </w:r>
           </w:p>
@@ -604,6 +641,12 @@
               </w:rPr>
             </w:pPr>
             <w:r>
+              <w:rPr>
+                <w:rFonts w:ascii="Times New Roman" w:hAnsi="Times New Roman" w:cs="Times New Roman" w:eastAsia="Times New Roman"/>
+                <w:b w:val="0"/>
+                <w:i w:val="0"/>
+                <w:sz w:val="25"/>
+              </w:rPr>
               <w:t>{j_pk6}</w:t>
             </w:r>
           </w:p>
@@ -664,6 +707,12 @@
               </w:rPr>
             </w:pPr>
             <w:r>
+              <w:rPr>
+                <w:rFonts w:ascii="Times New Roman" w:hAnsi="Times New Roman" w:cs="Times New Roman" w:eastAsia="Times New Roman"/>
+                <w:b w:val="0"/>
+                <w:i w:val="0"/>
+                <w:sz w:val="25"/>
+              </w:rPr>
               <w:t>{j_pk7}</w:t>
             </w:r>
           </w:p>
@@ -692,6 +741,12 @@
               </w:rPr>
             </w:pPr>
             <w:r>
+              <w:rPr>
+                <w:rFonts w:ascii="Times New Roman" w:hAnsi="Times New Roman" w:cs="Times New Roman" w:eastAsia="Times New Roman"/>
+                <w:b w:val="0"/>
+                <w:i w:val="0"/>
+                <w:sz w:val="25"/>
+              </w:rPr>
               <w:t>{j_pk8}</w:t>
             </w:r>
           </w:p>
@@ -720,6 +775,12 @@
               </w:rPr>
             </w:pPr>
             <w:r>
+              <w:rPr>
+                <w:rFonts w:ascii="Times New Roman" w:hAnsi="Times New Roman" w:cs="Times New Roman" w:eastAsia="Times New Roman"/>
+                <w:b w:val="0"/>
+                <w:i w:val="0"/>
+                <w:sz w:val="25"/>
+              </w:rPr>
               <w:t>{j_pk9}</w:t>
             </w:r>
           </w:p>
@@ -748,6 +809,12 @@
               </w:rPr>
             </w:pPr>
             <w:r>
+              <w:rPr>
+                <w:rFonts w:ascii="Times New Roman" w:hAnsi="Times New Roman" w:cs="Times New Roman" w:eastAsia="Times New Roman"/>
+                <w:b w:val="0"/>
+                <w:i w:val="0"/>
+                <w:sz w:val="25"/>
+              </w:rPr>
               <w:t>{j_pk10}</w:t>
             </w:r>
           </w:p>
@@ -776,6 +843,12 @@
               </w:rPr>
             </w:pPr>
             <w:r>
+              <w:rPr>
+                <w:rFonts w:ascii="Times New Roman" w:hAnsi="Times New Roman" w:cs="Times New Roman" w:eastAsia="Times New Roman"/>
+                <w:b w:val="0"/>
+                <w:i w:val="0"/>
+                <w:sz w:val="25"/>
+              </w:rPr>
               <w:t>{j_pk11}</w:t>
             </w:r>
           </w:p>
@@ -3263,7 +3336,7 @@
           <w:szCs w:val="25"/>
           <w:lang w:eastAsia="ar-SA"/>
         </w:rPr>
-        <w:t>Līgums sagatavots latviešu valodā uz ___ (_______________) lapām elektroniskā dokumenta formā, kas glabājas pie katra no Līdzējiem.</w:t>
+        <w:t>Līgums sagatavots latviešu valodā uz ________ (______________________) lapām elektroniskā dokumenta formā, kas glabājas pie katra no Līdzējiem.</w:t>
       </w:r>
     </w:p>
     <w:p>
@@ -3569,6 +3642,7 @@
               <w:autoSpaceDN w:val="0"/>
               <w:adjustRightInd w:val="0"/>
               <w:spacing w:after="0" w:line="240" w:lineRule="auto"/>
+              <w:jc w:val="center"/>
               <w:rPr>
                 <w:rFonts w:ascii="Times New Roman" w:eastAsia="Calibri" w:hAnsi="Times New Roman" w:cs="Times New Roman"/>
                 <w:color w:val="000000"/>
@@ -3578,6 +3652,12 @@
               </w:rPr>
             </w:pPr>
             <w:r>
+              <w:rPr>
+                <w:rFonts w:ascii="Times New Roman" w:hAnsi="Times New Roman" w:cs="Times New Roman" w:eastAsia="Times New Roman"/>
+                <w:b w:val="0"/>
+                <w:i w:val="0"/>
+                <w:sz w:val="25"/>
+              </w:rPr>
               <w:t>{j_vards_pk}</w:t>
             </w:r>
           </w:p>
@@ -3803,6 +3883,7 @@
               <w:autoSpaceDN w:val="0"/>
               <w:adjustRightInd w:val="0"/>
               <w:spacing w:after="0" w:line="240" w:lineRule="auto"/>
+              <w:jc w:val="center"/>
               <w:rPr>
                 <w:rFonts w:ascii="Times New Roman" w:eastAsia="Calibri" w:hAnsi="Times New Roman" w:cs="Times New Roman"/>
                 <w:color w:val="000000"/>
@@ -3812,6 +3893,12 @@
               </w:rPr>
             </w:pPr>
             <w:r>
+              <w:rPr>
+                <w:rFonts w:ascii="Times New Roman" w:hAnsi="Times New Roman" w:cs="Times New Roman" w:eastAsia="Times New Roman"/>
+                <w:b w:val="0"/>
+                <w:i w:val="0"/>
+                <w:sz w:val="25"/>
+              </w:rPr>
               <w:t>{j_adrese_dekl}</w:t>
             </w:r>
           </w:p>
@@ -4007,6 +4094,7 @@
               <w:autoSpaceDN w:val="0"/>
               <w:adjustRightInd w:val="0"/>
               <w:spacing w:after="0" w:line="240" w:lineRule="auto"/>
+              <w:jc w:val="center"/>
               <w:rPr>
                 <w:rFonts w:ascii="Times New Roman" w:eastAsia="Calibri" w:hAnsi="Times New Roman" w:cs="Times New Roman"/>
                 <w:color w:val="000000"/>
@@ -4016,6 +4104,12 @@
               </w:rPr>
             </w:pPr>
             <w:r>
+              <w:rPr>
+                <w:rFonts w:ascii="Times New Roman" w:hAnsi="Times New Roman" w:cs="Times New Roman" w:eastAsia="Times New Roman"/>
+                <w:b w:val="0"/>
+                <w:i w:val="0"/>
+                <w:sz w:val="25"/>
+              </w:rPr>
               <w:t>{j_adrese_fakt}</w:t>
             </w:r>
           </w:p>
@@ -4144,6 +4238,7 @@
               <w:autoSpaceDN w:val="0"/>
               <w:adjustRightInd w:val="0"/>
               <w:spacing w:after="0" w:line="240" w:lineRule="auto"/>
+              <w:jc w:val="center"/>
               <w:rPr>
                 <w:rFonts w:ascii="Times New Roman" w:eastAsia="Calibri" w:hAnsi="Times New Roman" w:cs="Times New Roman"/>
                 <w:i/>
@@ -4155,8 +4250,9 @@
             </w:pPr>
             <w:r>
               <w:rPr>
-                <w:rFonts w:ascii="Times New Roman" w:eastAsia="Calibri" w:hAnsi="Times New Roman" w:cs="Times New Roman"/>
-                <w:i/>
+                <w:rFonts w:ascii="Times New Roman" w:eastAsia="Times New Roman" w:hAnsi="Times New Roman" w:cs="Times New Roman"/>
+                <w:b w:val="0"/>
+                <w:i w:val="0"/>
                 <w:color w:val="000000"/>
                 <w:sz w:val="25"/>
                 <w:szCs w:val="25"/>
@@ -4357,6 +4453,7 @@
               <w:autoSpaceDN w:val="0"/>
               <w:adjustRightInd w:val="0"/>
               <w:spacing w:after="0" w:line="240" w:lineRule="auto"/>
+              <w:jc w:val="center"/>
               <w:rPr>
                 <w:rFonts w:ascii="Times New Roman" w:eastAsia="Calibri" w:hAnsi="Times New Roman" w:cs="Times New Roman"/>
                 <w:color w:val="000000"/>
@@ -4366,6 +4463,12 @@
               </w:rPr>
             </w:pPr>
             <w:r>
+              <w:rPr>
+                <w:rFonts w:ascii="Times New Roman" w:hAnsi="Times New Roman" w:cs="Times New Roman" w:eastAsia="Times New Roman"/>
+                <w:b w:val="0"/>
+                <w:i w:val="0"/>
+                <w:sz w:val="25"/>
+              </w:rPr>
               <w:t>{i_vards}</w:t>
             </w:r>
           </w:p>

</xml_diff>

<commit_message>
Salikt līguma laukus iepriekšējā fontā un ierakstīt rīkojumu.
Aizpildāmās vietas atkal ir Times New Roman — numurs 14 pt, pārējie lauki 12,5 pt, paraksta datums atsevišķi no paraksta piezīmes. Ievadrindā atgriezti abi novada numuri. Instruktora pilnvarojums ir 2021. gada 14. septembra rīkojums Nr. 418, galvenē ir 2026. gada 15. oktobra grozījumi Nr. 7-NOT, un ārsta izziņa derīga 12 mēnešus.

Co-authored-by: janiseglis6 <janiseglis6@gmail.com>
</commit_message>
<xml_diff>
--- a/vendor/templates/ligums-jaunietis-edoc.docx
+++ b/vendor/templates/ligums-jaunietis-edoc.docx
@@ -3,11 +3,21 @@
 <w:document xmlns:mc="http://schemas.openxmlformats.org/markup-compatibility/2006" xmlns:r="http://schemas.openxmlformats.org/officeDocument/2006/relationships" xmlns:w="http://schemas.openxmlformats.org/wordprocessingml/2006/main" mc:Ignorable="w14 w15 w16se w16cid wp14">
   <w:body>
     <w:p>
-      <w:r>
-        <w:t>Līguma reģistrācijas Nr. {liguma_nr}</w:t>
-      </w:r>
-    </w:p>
-    <w:p/>
+      <w:pPr>
+        <w:jc w:val="right"/>
+      </w:pPr>
+      <w:r>
+        <w:rPr>
+          <w:rFonts w:ascii="Times New Roman" w:hAnsi="Times New Roman" w:cs="Times New Roman" w:eastAsia="Times New Roman"/>
+          <w:b w:val="0"/>
+          <w:i w:val="0"/>
+          <w:color w:val="000000"/>
+          <w:sz w:val="28"/>
+          <w:szCs w:val="24"/>
+        </w:rPr>
+        <w:t xml:space="preserve">Nr. {liguma_nr}</w:t>
+      </w:r>
+    </w:p>
     <w:p/>
     <w:p>
       <w:pPr>
@@ -99,8 +109,12 @@
       </w:pPr>
       <w:r>
         <w:rPr>
-          <w:sz w:val="25"/>
-          <w:szCs w:val="25"/>
+          <w:rFonts w:ascii="Times New Roman" w:hAnsi="Times New Roman" w:cs="Times New Roman" w:eastAsia="Times New Roman"/>
+          <w:sz w:val="25"/>
+          <w:szCs w:val="25"/>
+          <w:b w:val="0"/>
+          <w:i w:val="0"/>
+          <w:color w:val="000000"/>
         </w:rPr>
         <w:t>Līguma sagatavošanas vieta un datums: {vieta}, {liguma_datums}</w:t>
       </w:r>
@@ -164,10 +178,14 @@
       <w:proofErr w:type="spellEnd"/>
       <w:r>
         <w:rPr>
-          <w:sz w:val="25"/>
-          <w:szCs w:val="25"/>
-        </w:rPr>
-        <w:t xml:space="preserve"> iela 10/12, Rīga, tā {i_parvalde}.novada nodaļas jaunsargu instruktora {i_vards_gen} personā, kurš(-a) rīkojas pamatojoties uz </w:t>
+          <w:rFonts w:ascii="Times New Roman" w:hAnsi="Times New Roman" w:cs="Times New Roman" w:eastAsia="Times New Roman"/>
+          <w:sz w:val="25"/>
+          <w:szCs w:val="25"/>
+          <w:b w:val="0"/>
+          <w:i w:val="0"/>
+          <w:color w:val="000000"/>
+        </w:rPr>
+        <w:t xml:space="preserve"> iela 10/12, Rīga, tā {i_parvalde}.novada pārvaldes {i_nodala}.nodaļas jaunsargu instruktora {i_vards_gen} personā, kurš(-a) rīkojas pamatojoties uz </w:t>
       </w:r>
       <w:r>
         <w:rPr>
@@ -179,10 +197,14 @@
       </w:r>
       <w:r>
         <w:rPr>
-          <w:sz w:val="25"/>
-          <w:szCs w:val="25"/>
-        </w:rPr>
-        <w:t xml:space="preserve"> 20____.gada____. ______________ rīkojuma Nr._____________ „Par līgumu noslēgšanu „Par bērna un jaunieša dalību </w:t>
+          <w:rFonts w:ascii="Times New Roman" w:hAnsi="Times New Roman" w:cs="Times New Roman" w:eastAsia="Times New Roman"/>
+          <w:sz w:val="25"/>
+          <w:szCs w:val="25"/>
+          <w:b w:val="0"/>
+          <w:i w:val="0"/>
+          <w:color w:val="000000"/>
+        </w:rPr>
+        <w:t xml:space="preserve"> 2021.gada 14.septembra rīkojuma Nr.418 „Par pilnvarojumu jaunsargu instruktoriem slēgt līgumus”</w:t>
       </w:r>
       <w:proofErr w:type="spellStart"/>
       <w:r>
@@ -190,7 +212,7 @@
           <w:sz w:val="25"/>
           <w:szCs w:val="25"/>
         </w:rPr>
-        <w:t>Jaunsardzē</w:t>
+        <w:t/>
       </w:r>
       <w:proofErr w:type="spellEnd"/>
       <w:r>
@@ -198,14 +220,14 @@
           <w:sz w:val="25"/>
           <w:szCs w:val="25"/>
         </w:rPr>
-        <w:t>”</w:t>
-      </w:r>
-      <w:r>
-        <w:rPr>
-          <w:sz w:val="25"/>
-          <w:szCs w:val="25"/>
-        </w:rPr>
-        <w:t>”</w:t>
+        <w:t/>
+      </w:r>
+      <w:r>
+        <w:rPr>
+          <w:sz w:val="25"/>
+          <w:szCs w:val="25"/>
+        </w:rPr>
+        <w:t/>
       </w:r>
       <w:r>
         <w:rPr>
@@ -295,13 +317,21 @@
           <w:p>
             <w:pPr>
               <w:ind w:left="-108" w:right="-108"/>
-              <w:jc w:val="left"/>
+              <w:jc w:val="center"/>
               <w:rPr>
                 <w:sz w:val="25"/>
                 <w:szCs w:val="25"/>
               </w:rPr>
             </w:pPr>
             <w:r>
+              <w:rPr>
+                <w:rFonts w:ascii="Times New Roman" w:hAnsi="Times New Roman" w:cs="Times New Roman" w:eastAsia="Times New Roman"/>
+                <w:b w:val="0"/>
+                <w:i w:val="0"/>
+                <w:color w:val="000000"/>
+                <w:sz w:val="25"/>
+                <w:szCs w:val="25"/>
+              </w:rPr>
               <w:t>{j_statuss_vards}</w:t>
             </w:r>
           </w:p>
@@ -345,6 +375,14 @@
               </w:rPr>
             </w:pPr>
             <w:r>
+              <w:rPr>
+                <w:rFonts w:ascii="Times New Roman" w:hAnsi="Times New Roman" w:cs="Times New Roman" w:eastAsia="Times New Roman"/>
+                <w:b w:val="0"/>
+                <w:i w:val="0"/>
+                <w:color w:val="000000"/>
+                <w:sz w:val="25"/>
+                <w:szCs w:val="25"/>
+              </w:rPr>
               <w:t>{j_pk1}</w:t>
             </w:r>
           </w:p>
@@ -370,6 +408,14 @@
               </w:rPr>
             </w:pPr>
             <w:r>
+              <w:rPr>
+                <w:rFonts w:ascii="Times New Roman" w:hAnsi="Times New Roman" w:cs="Times New Roman" w:eastAsia="Times New Roman"/>
+                <w:b w:val="0"/>
+                <w:i w:val="0"/>
+                <w:color w:val="000000"/>
+                <w:sz w:val="25"/>
+                <w:szCs w:val="25"/>
+              </w:rPr>
               <w:t>{j_pk2}</w:t>
             </w:r>
           </w:p>
@@ -395,6 +441,14 @@
               </w:rPr>
             </w:pPr>
             <w:r>
+              <w:rPr>
+                <w:rFonts w:ascii="Times New Roman" w:hAnsi="Times New Roman" w:cs="Times New Roman" w:eastAsia="Times New Roman"/>
+                <w:b w:val="0"/>
+                <w:i w:val="0"/>
+                <w:color w:val="000000"/>
+                <w:sz w:val="25"/>
+                <w:szCs w:val="25"/>
+              </w:rPr>
               <w:t>{j_pk3}</w:t>
             </w:r>
           </w:p>
@@ -420,6 +474,14 @@
               </w:rPr>
             </w:pPr>
             <w:r>
+              <w:rPr>
+                <w:rFonts w:ascii="Times New Roman" w:hAnsi="Times New Roman" w:cs="Times New Roman" w:eastAsia="Times New Roman"/>
+                <w:b w:val="0"/>
+                <w:i w:val="0"/>
+                <w:color w:val="000000"/>
+                <w:sz w:val="25"/>
+                <w:szCs w:val="25"/>
+              </w:rPr>
               <w:t>{j_pk4}</w:t>
             </w:r>
           </w:p>
@@ -445,6 +507,14 @@
               </w:rPr>
             </w:pPr>
             <w:r>
+              <w:rPr>
+                <w:rFonts w:ascii="Times New Roman" w:hAnsi="Times New Roman" w:cs="Times New Roman" w:eastAsia="Times New Roman"/>
+                <w:b w:val="0"/>
+                <w:i w:val="0"/>
+                <w:color w:val="000000"/>
+                <w:sz w:val="25"/>
+                <w:szCs w:val="25"/>
+              </w:rPr>
               <w:t>{j_pk5}</w:t>
             </w:r>
           </w:p>
@@ -470,6 +540,14 @@
               </w:rPr>
             </w:pPr>
             <w:r>
+              <w:rPr>
+                <w:rFonts w:ascii="Times New Roman" w:hAnsi="Times New Roman" w:cs="Times New Roman" w:eastAsia="Times New Roman"/>
+                <w:b w:val="0"/>
+                <w:i w:val="0"/>
+                <w:color w:val="000000"/>
+                <w:sz w:val="25"/>
+                <w:szCs w:val="25"/>
+              </w:rPr>
               <w:t>{j_pk6}</w:t>
             </w:r>
           </w:p>
@@ -522,6 +600,14 @@
               </w:rPr>
             </w:pPr>
             <w:r>
+              <w:rPr>
+                <w:rFonts w:ascii="Times New Roman" w:hAnsi="Times New Roman" w:cs="Times New Roman" w:eastAsia="Times New Roman"/>
+                <w:b w:val="0"/>
+                <w:i w:val="0"/>
+                <w:color w:val="000000"/>
+                <w:sz w:val="25"/>
+                <w:szCs w:val="25"/>
+              </w:rPr>
               <w:t>{j_pk7}</w:t>
             </w:r>
           </w:p>
@@ -547,6 +633,14 @@
               </w:rPr>
             </w:pPr>
             <w:r>
+              <w:rPr>
+                <w:rFonts w:ascii="Times New Roman" w:hAnsi="Times New Roman" w:cs="Times New Roman" w:eastAsia="Times New Roman"/>
+                <w:b w:val="0"/>
+                <w:i w:val="0"/>
+                <w:color w:val="000000"/>
+                <w:sz w:val="25"/>
+                <w:szCs w:val="25"/>
+              </w:rPr>
               <w:t>{j_pk8}</w:t>
             </w:r>
           </w:p>
@@ -572,6 +666,14 @@
               </w:rPr>
             </w:pPr>
             <w:r>
+              <w:rPr>
+                <w:rFonts w:ascii="Times New Roman" w:hAnsi="Times New Roman" w:cs="Times New Roman" w:eastAsia="Times New Roman"/>
+                <w:b w:val="0"/>
+                <w:i w:val="0"/>
+                <w:color w:val="000000"/>
+                <w:sz w:val="25"/>
+                <w:szCs w:val="25"/>
+              </w:rPr>
               <w:t>{j_pk9}</w:t>
             </w:r>
           </w:p>
@@ -597,6 +699,14 @@
               </w:rPr>
             </w:pPr>
             <w:r>
+              <w:rPr>
+                <w:rFonts w:ascii="Times New Roman" w:hAnsi="Times New Roman" w:cs="Times New Roman" w:eastAsia="Times New Roman"/>
+                <w:b w:val="0"/>
+                <w:i w:val="0"/>
+                <w:color w:val="000000"/>
+                <w:sz w:val="25"/>
+                <w:szCs w:val="25"/>
+              </w:rPr>
               <w:t>{j_pk10}</w:t>
             </w:r>
           </w:p>
@@ -622,6 +732,14 @@
               </w:rPr>
             </w:pPr>
             <w:r>
+              <w:rPr>
+                <w:rFonts w:ascii="Times New Roman" w:hAnsi="Times New Roman" w:cs="Times New Roman" w:eastAsia="Times New Roman"/>
+                <w:b w:val="0"/>
+                <w:i w:val="0"/>
+                <w:color w:val="000000"/>
+                <w:sz w:val="25"/>
+                <w:szCs w:val="25"/>
+              </w:rPr>
               <w:t>{j_pk11}</w:t>
             </w:r>
           </w:p>
@@ -988,10 +1106,14 @@
       </w:pPr>
       <w:r>
         <w:rPr>
-          <w:sz w:val="25"/>
-          <w:szCs w:val="25"/>
-        </w:rPr>
-        <w:t>2.1.3. katra mācību gada sākumā iesniegt jaunsargu instruktoram ģimenes ārsta izziņu (veidlapa 027/u), kas attiecīgajā mācību gadā atļauj piedalīties Centra organizētajos pasākumos un nodarbībās, nekavējoties informēt jaunsargu instruktoru</w:t>
+          <w:rFonts w:ascii="Times New Roman" w:hAnsi="Times New Roman" w:cs="Times New Roman" w:eastAsia="Times New Roman"/>
+          <w:sz w:val="25"/>
+          <w:szCs w:val="25"/>
+          <w:b w:val="0"/>
+          <w:i w:val="0"/>
+          <w:color w:val="000000"/>
+        </w:rPr>
+        <w:t>2.1.3. iesniegt jaunsargu instruktoram ģimenes ārsta izziņu (veidlapa 027/u), kas ir derīga 12 mēnešus no tās izsniegšanas dienas un atļauj piedalīties Centra organizētajos pasākumos un nodarbībās, nekavējoties informēt jaunsargu instruktoru</w:t>
       </w:r>
       <w:r>
         <w:rPr>
@@ -1919,28 +2041,28 @@
           <w:sz w:val="25"/>
           <w:szCs w:val="25"/>
         </w:rPr>
-        <w:t xml:space="preserve">3.2.2.4. jaunietis attiecīgajā gadā līdz </w:t>
-      </w:r>
-      <w:r>
-        <w:rPr>
-          <w:sz w:val="25"/>
-          <w:szCs w:val="25"/>
-        </w:rPr>
-        <w:t>mācību gada sākum</w:t>
-      </w:r>
-      <w:r>
-        <w:rPr>
-          <w:sz w:val="25"/>
-          <w:szCs w:val="25"/>
-        </w:rPr>
-        <w:t>am</w:t>
-      </w:r>
-      <w:r>
-        <w:rPr>
-          <w:sz w:val="25"/>
-          <w:szCs w:val="25"/>
-        </w:rPr>
-        <w:t xml:space="preserve"> </w:t>
+        <w:t xml:space="preserve">3.2.2.4. jaunietis </w:t>
+      </w:r>
+      <w:r>
+        <w:rPr>
+          <w:sz w:val="25"/>
+          <w:szCs w:val="25"/>
+        </w:rPr>
+        <w:t/>
+      </w:r>
+      <w:r>
+        <w:rPr>
+          <w:sz w:val="25"/>
+          <w:szCs w:val="25"/>
+        </w:rPr>
+        <w:t/>
+      </w:r>
+      <w:r>
+        <w:rPr>
+          <w:sz w:val="25"/>
+          <w:szCs w:val="25"/>
+        </w:rPr>
+        <w:t xml:space="preserve"/>
       </w:r>
       <w:r>
         <w:rPr>
@@ -1951,10 +2073,14 @@
       </w:r>
       <w:r>
         <w:rPr>
-          <w:sz w:val="25"/>
-          <w:szCs w:val="25"/>
-        </w:rPr>
-        <w:t>ģimenes ārsta izziņu (veidlapa 027/u), kas attiecīgajā mācību gadā atļauj piedalīties Centra organizētajos pasākumos un mācību nodarbībās</w:t>
+          <w:rFonts w:ascii="Times New Roman" w:hAnsi="Times New Roman" w:cs="Times New Roman" w:eastAsia="Times New Roman"/>
+          <w:sz w:val="25"/>
+          <w:szCs w:val="25"/>
+          <w:b w:val="0"/>
+          <w:i w:val="0"/>
+          <w:color w:val="000000"/>
+        </w:rPr>
+        <w:t>ģimenes ārsta izziņu (veidlapa 027/u), kas ir derīga 12 mēnešus no tās izsniegšanas dienas un atļauj piedalīties Centra organizētajos pasākumos un mācību nodarbībās</w:t>
       </w:r>
       <w:r>
         <w:rPr>
@@ -2258,10 +2384,14 @@
       </w:r>
       <w:r>
         <w:rPr>
-          <w:sz w:val="25"/>
-          <w:szCs w:val="25"/>
-        </w:rPr>
-        <w:t xml:space="preserve"> nav iesniedzis Centrā ģimenes ārsta izziņu (veidlapa 027/u), kas attiecīgajā mācību gadā atļauj piedalīties </w:t>
+          <w:rFonts w:ascii="Times New Roman" w:hAnsi="Times New Roman" w:cs="Times New Roman" w:eastAsia="Times New Roman"/>
+          <w:sz w:val="25"/>
+          <w:szCs w:val="25"/>
+          <w:b w:val="0"/>
+          <w:i w:val="0"/>
+          <w:color w:val="000000"/>
+        </w:rPr>
+        <w:t xml:space="preserve"> nav iesniedzis Centrā ģimenes ārsta izziņu (veidlapa 027/u), kas ir derīga 12 mēnešus no tās izsniegšanas dienas un atļauj piedalīties </w:t>
       </w:r>
       <w:r>
         <w:rPr>
@@ -3305,8 +3435,17 @@
                 <w:sz w:val="25"/>
                 <w:szCs w:val="25"/>
               </w:rPr>
+              <w:jc w:val="center"/>
             </w:pPr>
             <w:r>
+              <w:rPr>
+                <w:rFonts w:ascii="Times New Roman" w:hAnsi="Times New Roman" w:cs="Times New Roman" w:eastAsia="Times New Roman"/>
+                <w:b w:val="0"/>
+                <w:i w:val="0"/>
+                <w:color w:val="000000"/>
+                <w:sz w:val="25"/>
+                <w:szCs w:val="25"/>
+              </w:rPr>
               <w:t>{j_vards_pk}</w:t>
             </w:r>
           </w:p>
@@ -3509,8 +3648,17 @@
                 <w:sz w:val="25"/>
                 <w:szCs w:val="25"/>
               </w:rPr>
+              <w:jc w:val="center"/>
             </w:pPr>
             <w:r>
+              <w:rPr>
+                <w:rFonts w:ascii="Times New Roman" w:hAnsi="Times New Roman" w:cs="Times New Roman" w:eastAsia="Times New Roman"/>
+                <w:b w:val="0"/>
+                <w:i w:val="0"/>
+                <w:color w:val="000000"/>
+                <w:sz w:val="25"/>
+                <w:szCs w:val="25"/>
+              </w:rPr>
               <w:t>{j_adrese_dekl}</w:t>
             </w:r>
           </w:p>
@@ -3693,8 +3841,17 @@
                 <w:sz w:val="25"/>
                 <w:szCs w:val="25"/>
               </w:rPr>
+              <w:jc w:val="center"/>
             </w:pPr>
             <w:r>
+              <w:rPr>
+                <w:rFonts w:ascii="Times New Roman" w:hAnsi="Times New Roman" w:cs="Times New Roman" w:eastAsia="Times New Roman"/>
+                <w:b w:val="0"/>
+                <w:i w:val="0"/>
+                <w:color w:val="000000"/>
+                <w:sz w:val="25"/>
+                <w:szCs w:val="25"/>
+              </w:rPr>
               <w:t>{j_adrese_fakt}</w:t>
             </w:r>
           </w:p>
@@ -3818,28 +3975,17 @@
                 <w:sz w:val="25"/>
                 <w:szCs w:val="25"/>
               </w:rPr>
+              <w:jc w:val="center"/>
             </w:pPr>
             <w:r>
               <w:rPr>
-                <w:rFonts w:eastAsia="Calibri"/>
-                <w:i/>
-                <w:color w:val="000000"/>
-                <w:sz w:val="25"/>
-                <w:szCs w:val="25"/>
-              </w:rPr>
-              <w:tab/>
-            </w:r>
-            <w:r>
-              <w:rPr>
-                <w:rFonts w:eastAsia="Calibri"/>
-                <w:i/>
-                <w:color w:val="000000"/>
-                <w:sz w:val="25"/>
-                <w:szCs w:val="25"/>
-              </w:rPr>
-              <w:tab/>
-            </w:r>
-            <w:r>
+                <w:rFonts w:ascii="Times New Roman" w:hAnsi="Times New Roman" w:cs="Times New Roman" w:eastAsia="Times New Roman"/>
+                <w:b w:val="0"/>
+                <w:i w:val="0"/>
+                <w:color w:val="000000"/>
+                <w:sz w:val="25"/>
+                <w:szCs w:val="25"/>
+              </w:rPr>
               <w:t>{i_amats}</w:t>
             </w:r>
           </w:p>
@@ -4015,8 +4161,17 @@
                 <w:szCs w:val="25"/>
                 <w:lang w:val="en-US"/>
               </w:rPr>
+              <w:jc w:val="center"/>
             </w:pPr>
             <w:r>
+              <w:rPr>
+                <w:rFonts w:ascii="Times New Roman" w:hAnsi="Times New Roman" w:cs="Times New Roman" w:eastAsia="Times New Roman"/>
+                <w:b w:val="0"/>
+                <w:i w:val="0"/>
+                <w:color w:val="000000"/>
+                <w:sz w:val="25"/>
+                <w:szCs w:val="25"/>
+              </w:rPr>
               <w:t>{i_vards}</w:t>
             </w:r>
           </w:p>
@@ -4195,10 +4350,12 @@
             </w:pPr>
             <w:r>
               <w:rPr>
-                <w:rFonts w:eastAsia="Calibri"/>
-                <w:color w:val="000000"/>
-                <w:sz w:val="25"/>
-                <w:szCs w:val="25"/>
+                <w:rFonts w:eastAsia="Times New Roman" w:ascii="Times New Roman" w:hAnsi="Times New Roman" w:cs="Times New Roman"/>
+                <w:color w:val="000000"/>
+                <w:sz w:val="25"/>
+                <w:szCs w:val="25"/>
+                <w:b w:val="0"/>
+                <w:i w:val="0"/>
               </w:rPr>
               <w:t>Tālrunis: {i_talrunis}</w:t>
             </w:r>
@@ -4254,10 +4411,12 @@
             </w:pPr>
             <w:r>
               <w:rPr>
-                <w:rFonts w:eastAsia="Calibri"/>
-                <w:color w:val="000000"/>
-                <w:sz w:val="25"/>
-                <w:szCs w:val="25"/>
+                <w:rFonts w:eastAsia="Times New Roman" w:ascii="Times New Roman" w:hAnsi="Times New Roman" w:cs="Times New Roman"/>
+                <w:color w:val="000000"/>
+                <w:sz w:val="25"/>
+                <w:szCs w:val="25"/>
+                <w:b w:val="0"/>
+                <w:i w:val="0"/>
               </w:rPr>
               <w:t xml:space="preserve">Tālrunis: {j_talrunis} </w:t>
             </w:r>
@@ -4294,10 +4453,12 @@
             </w:pPr>
             <w:r>
               <w:rPr>
-                <w:rFonts w:eastAsia="Calibri"/>
-                <w:color w:val="000000"/>
-                <w:sz w:val="25"/>
-                <w:szCs w:val="25"/>
+                <w:rFonts w:eastAsia="Times New Roman" w:ascii="Times New Roman" w:hAnsi="Times New Roman" w:cs="Times New Roman"/>
+                <w:color w:val="000000"/>
+                <w:sz w:val="25"/>
+                <w:szCs w:val="25"/>
+                <w:b w:val="0"/>
+                <w:i w:val="0"/>
               </w:rPr>
               <w:t xml:space="preserve">e-pasts: {i_epasts} </w:t>
             </w:r>
@@ -4353,10 +4514,12 @@
             </w:pPr>
             <w:r>
               <w:rPr>
-                <w:rFonts w:eastAsia="Calibri"/>
-                <w:color w:val="000000"/>
-                <w:sz w:val="25"/>
-                <w:szCs w:val="25"/>
+                <w:rFonts w:eastAsia="Times New Roman" w:ascii="Times New Roman" w:hAnsi="Times New Roman" w:cs="Times New Roman"/>
+                <w:color w:val="000000"/>
+                <w:sz w:val="25"/>
+                <w:szCs w:val="25"/>
+                <w:b w:val="0"/>
+                <w:i w:val="0"/>
               </w:rPr>
               <w:t xml:space="preserve">e-pasts: {j_epasts} </w:t>
             </w:r>
@@ -4504,7 +4667,7 @@
 </file>
 
 <file path=word/header1.xml><?xml version="1.0" encoding="utf-8"?>
-<w:hdr xmlns:wpc="http://schemas.microsoft.com/office/word/2010/wordprocessingCanvas" xmlns:cx="http://schemas.microsoft.com/office/drawing/2014/chartex" xmlns:cx1="http://schemas.microsoft.com/office/drawing/2015/9/8/chartex" xmlns:cx2="http://schemas.microsoft.com/office/drawing/2015/10/21/chartex" xmlns:cx3="http://schemas.microsoft.com/office/drawing/2016/5/9/chartex" xmlns:cx4="http://schemas.microsoft.com/office/drawing/2016/5/10/chartex" xmlns:cx5="http://schemas.microsoft.com/office/drawing/2016/5/11/chartex" xmlns:cx6="http://schemas.microsoft.com/office/drawing/2016/5/12/chartex" xmlns:cx7="http://schemas.microsoft.com/office/drawing/2016/5/13/chartex" xmlns:cx8="http://schemas.microsoft.com/office/drawing/2016/5/14/chartex" xmlns:mc="http://schemas.openxmlformats.org/markup-compatibility/2006" xmlns:aink="http://schemas.microsoft.com/office/drawing/2016/ink" xmlns:am3d="http://schemas.microsoft.com/office/drawing/2017/model3d" xmlns:o="urn:schemas-microsoft-com:office:office" xmlns:r="http://schemas.openxmlformats.org/officeDocument/2006/relationships" xmlns:m="http://schemas.openxmlformats.org/officeDocument/2006/math" xmlns:v="urn:schemas-microsoft-com:vml" xmlns:wp14="http://schemas.microsoft.com/office/word/2010/wordprocessingDrawing" xmlns:wp="http://schemas.openxmlformats.org/drawingml/2006/wordprocessingDrawing" xmlns:w10="urn:schemas-microsoft-com:office:word" xmlns:w="http://schemas.openxmlformats.org/wordprocessingml/2006/main" xmlns:w14="http://schemas.microsoft.com/office/word/2010/wordml" xmlns:w15="http://schemas.microsoft.com/office/word/2012/wordml" xmlns:w16cid="http://schemas.microsoft.com/office/word/2016/wordml/cid" xmlns:w16se="http://schemas.microsoft.com/office/word/2015/wordml/symex" xmlns:wpg="http://schemas.microsoft.com/office/word/2010/wordprocessingGroup" xmlns:wpi="http://schemas.microsoft.com/office/word/2010/wordprocessingInk" xmlns:wne="http://schemas.microsoft.com/office/word/2006/wordml" xmlns:wps="http://schemas.microsoft.com/office/word/2010/wordprocessingShape" mc:Ignorable="w14 w15 w16se w16cid wp14">
+<w:hdr xmlns:mc="http://schemas.openxmlformats.org/markup-compatibility/2006" xmlns:w="http://schemas.openxmlformats.org/wordprocessingml/2006/main" mc:Ignorable="w14 w15 w16se w16cid wp14">
   <w:p>
     <w:pPr>
       <w:jc w:val="right"/>
@@ -4612,6 +4775,26 @@
         <w:szCs w:val="20"/>
       </w:rPr>
       <w:t>”</w:t>
+    </w:r>
+  </w:p>
+  <w:p>
+    <w:pPr>
+      <w:jc w:val="right"/>
+      <w:rPr>
+        <w:sz w:val="20"/>
+        <w:szCs w:val="20"/>
+      </w:rPr>
+    </w:pPr>
+    <w:r>
+      <w:rPr>
+        <w:rFonts w:ascii="Times New Roman" w:hAnsi="Times New Roman" w:cs="Times New Roman" w:eastAsia="Times New Roman"/>
+        <w:b w:val="0"/>
+        <w:i w:val="0"/>
+        <w:color w:val="000000"/>
+        <w:sz w:val="20"/>
+        <w:szCs w:val="20"/>
+      </w:rPr>
+      <w:t>ar grozījumiem, kas izdarīti ar 2026.gada 15.oktobra noteikumiem Nr.7-NOT</w:t>
     </w:r>
   </w:p>
 </w:hdr>

</xml_diff>

<commit_message>
Līgumā dzimšanas datums ierakstās esošajā līnijā.
Atzīme {j_dzimsanas_datums} paliek veidlapas rindā virs paraksta “(dzimšanas datums)” un aizpildās no kartītes formātā dd.mm.gggg.

Co-authored-by: janiseglis6 <janiseglis6@gmail.com>
</commit_message>
<xml_diff>
--- a/vendor/templates/ligums-jaunietis-edoc.docx
+++ b/vendor/templates/ligums-jaunietis-edoc.docx
@@ -1261,20 +1261,22 @@
               <ns0:ind ns0:left="-108" ns0:right="-119"/>
               <ns0:jc ns0:val="center"/>
               <ns0:rPr>
-                <ns0:rFonts ns0:eastAsia="Times New Roman"/>
-                <ns0:i/>
-                <ns0:sz ns0:val="12"/>
-                <ns0:szCs ns0:val="12"/>
+                <ns0:rFonts ns0:ascii="Times New Roman" ns0:hAnsi="Times New Roman" ns0:cs="Times New Roman" ns0:eastAsia="Times New Roman"/>
+                <ns0:i ns0:val="0"/>
+                <ns0:sz ns0:val="25"/>
+                <ns0:szCs ns0:val="25"/>
               </ns0:rPr>
             </ns0:pPr>
             <ns0:r>
               <ns0:rPr>
-                <ns0:rFonts ns0:eastAsia="Times New Roman"/>
-                <ns0:i/>
-                <ns0:sz ns0:val="12"/>
-                <ns0:szCs ns0:val="12"/>
-              </ns0:rPr>
-              <ns0:t>________________________________________________________</ns0:t>
+                <ns0:rFonts ns0:ascii="Times New Roman" ns0:hAnsi="Times New Roman" ns0:cs="Times New Roman" ns0:eastAsia="Times New Roman"/>
+                <ns0:i ns0:val="0"/>
+                <ns0:b ns0:val="0"/>
+                <ns0:color ns0:val="000000"/>
+                <ns0:sz ns0:val="25"/>
+                <ns0:szCs ns0:val="25"/>
+              </ns0:rPr>
+              <ns0:t>{j_dzimsanas_datums}</ns0:t>
             </ns0:r>
           </ns0:p>
           <ns0:p ns2:paraId="6E876622" ns2:textId="77777777" ns0:rsidR="00AD6593" ns0:rsidRPr="004C3CB1" ns0:rsidRDefault="00ED667D" ns0:rsidP="00AA3A7E">

</xml_diff>

<commit_message>
Rekvizītu rindas līdzināt pa kreisi un nerādīt tukšu piezīmi.
Līguma rekvizītos tālrunis un e-pasts vairs netiek izstiepti pa visu šūnu. Tukšā svītra ir tikpat gara kā oficiālajā veidlapā, tāpēc “Bērna e-pasts” paliek vienā rindā. Tukša oranža piezīme zem dzimšanas datuma vairs nerādās.

Co-authored-by: janiseglis6 <janiseglis6@gmail.com>
</commit_message>
<xml_diff>
--- a/vendor/templates/ligums-jaunietis-edoc.docx
+++ b/vendor/templates/ligums-jaunietis-edoc.docx
@@ -4564,6 +4564,7 @@
           </ns0:tcPr>
           <ns0:p ns2:paraId="0376C66B" ns2:textId="77777777" ns0:rsidR="00AD6593" ns0:rsidRPr="004C3CB1" ns0:rsidRDefault="00ED667D" ns0:rsidP="00AA3A7E">
             <ns0:pPr>
+              <ns0:jc ns0:val="left"/>
               <ns0:autoSpaceDE ns0:val="0"/>
               <ns0:autoSpaceDN ns0:val="0"/>
               <ns0:adjustRightInd ns0:val="0"/>
@@ -4588,6 +4589,7 @@
           </ns0:p>
           <ns0:p ns2:paraId="7EA69E94" ns2:textId="77777777" ns0:rsidR="00AD6593" ns0:rsidRPr="004C3CB1" ns0:rsidRDefault="00AD6593" ns0:rsidP="00AA3A7E">
             <ns0:pPr>
+              <ns0:jc ns0:val="left"/>
               <ns0:autoSpaceDE ns0:val="0"/>
               <ns0:autoSpaceDN ns0:val="0"/>
               <ns0:adjustRightInd ns0:val="0"/>
@@ -4613,6 +4615,7 @@
           </ns0:tcPr>
           <ns0:p ns2:paraId="591E9E4F" ns2:textId="77777777" ns0:rsidR="00AD6593" ns0:rsidRPr="004C3CB1" ns0:rsidRDefault="00AD6593" ns0:rsidP="00AA3A7E">
             <ns0:pPr>
+              <ns0:jc ns0:val="left"/>
               <ns0:autoSpaceDE ns0:val="0"/>
               <ns0:autoSpaceDN ns0:val="0"/>
               <ns0:adjustRightInd ns0:val="0"/>
@@ -4627,6 +4630,7 @@
           </ns0:p>
           <ns0:p ns2:paraId="06AC10FF" ns2:textId="77777777" ns0:rsidR="00AD6593" ns0:rsidRPr="004C3CB1" ns0:rsidRDefault="00AD6593" ns0:rsidP="00AA3A7E">
             <ns0:pPr>
+              <ns0:jc ns0:val="left"/>
               <ns0:autoSpaceDE ns0:val="0"/>
               <ns0:autoSpaceDN ns0:val="0"/>
               <ns0:adjustRightInd ns0:val="0"/>
@@ -4653,6 +4657,7 @@
           </ns0:tcPr>
           <ns0:p ns2:paraId="1214C761" ns2:textId="77777777" ns0:rsidR="00AD6593" ns0:rsidRPr="004C3CB1" ns0:rsidRDefault="00ED667D" ns0:rsidP="00AA3A7E">
             <ns0:pPr>
+              <ns0:jc ns0:val="left"/>
               <ns0:autoSpaceDE ns0:val="0"/>
               <ns0:autoSpaceDN ns0:val="0"/>
               <ns0:adjustRightInd ns0:val="0"/>
@@ -4695,6 +4700,7 @@
           </ns0:tcPr>
           <ns0:p ns2:paraId="00D44D4B" ns2:textId="77777777" ns0:rsidR="00AD6593" ns0:rsidRPr="004C3CB1" ns0:rsidRDefault="00ED667D" ns0:rsidP="00AA3A7E">
             <ns0:pPr>
+              <ns0:jc ns0:val="left"/>
               <ns0:autoSpaceDE ns0:val="0"/>
               <ns0:autoSpaceDN ns0:val="0"/>
               <ns0:adjustRightInd ns0:val="0"/>
@@ -4742,6 +4748,7 @@
           </ns0:tcPr>
           <ns0:p ns2:paraId="6BA5FA0E" ns2:textId="77777777" ns0:rsidR="00AD6593" ns0:rsidRPr="004C3CB1" ns0:rsidRDefault="00AD6593" ns0:rsidP="00AA3A7E">
             <ns0:pPr>
+              <ns0:jc ns0:val="left"/>
               <ns0:autoSpaceDE ns0:val="0"/>
               <ns0:autoSpaceDN ns0:val="0"/>
               <ns0:adjustRightInd ns0:val="0"/>
@@ -4809,6 +4816,7 @@
           </ns0:tcPr>
           <ns0:p ns2:paraId="2F354C80" ns2:textId="77777777" ns0:rsidR="00AD6593" ns0:rsidRPr="004C3CB1" ns0:rsidRDefault="00ED667D" ns0:rsidP="00AA3A7E">
             <ns0:pPr>
+              <ns0:jc ns0:val="left"/>
               <ns0:autoSpaceDE ns0:val="0"/>
               <ns0:autoSpaceDN ns0:val="0"/>
               <ns0:adjustRightInd ns0:val="0"/>
@@ -4861,6 +4869,7 @@
           </ns0:tcPr>
           <ns0:p ns2:paraId="2AC4A756" ns2:textId="77777777" ns0:rsidR="00AD6593" ns0:rsidRPr="004C3CB1" ns0:rsidRDefault="00AD6593" ns0:rsidP="00AA3A7E">
             <ns0:pPr>
+              <ns0:jc ns0:val="left"/>
               <ns0:autoSpaceDE ns0:val="0"/>
               <ns0:autoSpaceDN ns0:val="0"/>
               <ns0:adjustRightInd ns0:val="0"/>
@@ -4927,6 +4936,7 @@
           </ns0:tcPr>
           <ns0:p ns2:paraId="5809F169" ns2:textId="77777777" ns0:rsidR="00AD6593" ns0:rsidRPr="004C3CB1" ns0:rsidRDefault="00ED667D" ns0:rsidP="00AA3A7E">
             <ns0:pPr>
+              <ns0:jc ns0:val="left"/>
               <ns0:autoSpaceDE ns0:val="0"/>
               <ns0:autoSpaceDN ns0:val="0"/>
               <ns0:adjustRightInd ns0:val="0"/>
@@ -4970,6 +4980,7 @@
           </ns0:tcPr>
           <ns0:p ns2:paraId="107F217D" ns2:textId="77777777" ns0:rsidR="00AD6593" ns0:rsidRPr="004C3CB1" ns0:rsidRDefault="00AD6593" ns0:rsidP="00AA3A7E">
             <ns0:pPr>
+              <ns0:jc ns0:val="left"/>
               <ns0:autoSpaceDE ns0:val="0"/>
               <ns0:autoSpaceDN ns0:val="0"/>
               <ns0:adjustRightInd ns0:val="0"/>
@@ -5038,6 +5049,7 @@
           </ns0:tcPr>
           <ns0:p ns2:paraId="5FBB868A" ns2:textId="77777777" ns0:rsidR="00AD6593" ns0:rsidRPr="004C3CB1" ns0:rsidRDefault="00ED667D" ns0:rsidP="00AA3A7E">
             <ns0:pPr>
+              <ns0:jc ns0:val="left"/>
               <ns0:autoSpaceDE ns0:val="0"/>
               <ns0:autoSpaceDN ns0:val="0"/>
               <ns0:adjustRightInd ns0:val="0"/>
@@ -5090,6 +5102,7 @@
           </ns0:tcPr>
           <ns0:p ns2:paraId="38254EEC" ns2:textId="77777777" ns0:rsidR="00AD6593" ns0:rsidRPr="004C3CB1" ns0:rsidRDefault="00AD6593" ns0:rsidP="00AA3A7E">
             <ns0:pPr>
+              <ns0:jc ns0:val="left"/>
               <ns0:autoSpaceDE ns0:val="0"/>
               <ns0:autoSpaceDN ns0:val="0"/>
               <ns0:adjustRightInd ns0:val="0"/>
@@ -5156,6 +5169,7 @@
           </ns0:tcPr>
           <ns0:p ns2:paraId="739124FB" ns2:textId="77777777" ns0:rsidR="00AD6593" ns0:rsidRPr="004C3CB1" ns0:rsidRDefault="00AD6593" ns0:rsidP="00AA3A7E">
             <ns0:pPr>
+              <ns0:jc ns0:val="left"/>
               <ns0:autoSpaceDE ns0:val="0"/>
               <ns0:autoSpaceDN ns0:val="0"/>
               <ns0:adjustRightInd ns0:val="0"/>
@@ -5181,6 +5195,7 @@
           </ns0:tcPr>
           <ns0:p ns2:paraId="2244B3F0" ns2:textId="77777777" ns0:rsidR="00AD6593" ns0:rsidRPr="004C3CB1" ns0:rsidRDefault="00AD6593" ns0:rsidP="00AA3A7E">
             <ns0:pPr>
+              <ns0:jc ns0:val="left"/>
               <ns0:autoSpaceDE ns0:val="0"/>
               <ns0:autoSpaceDN ns0:val="0"/>
               <ns0:adjustRightInd ns0:val="0"/>
@@ -5249,6 +5264,7 @@
           </ns0:tcPr>
           <ns0:p ns2:paraId="631C1B51" ns2:textId="77777777" ns0:rsidR="00AD6593" ns0:rsidRPr="004C3CB1" ns0:rsidRDefault="00AD6593" ns0:rsidP="00AA3A7E">
             <ns0:pPr>
+              <ns0:jc ns0:val="left"/>
               <ns0:autoSpaceDE ns0:val="0"/>
               <ns0:autoSpaceDN ns0:val="0"/>
               <ns0:adjustRightInd ns0:val="0"/>
@@ -5274,6 +5290,7 @@
           </ns0:tcPr>
           <ns0:p ns2:paraId="4850E045" ns2:textId="77777777" ns0:rsidR="00AD6593" ns0:rsidRPr="004C3CB1" ns0:rsidRDefault="00AD6593" ns0:rsidP="00AA3A7E">
             <ns0:pPr>
+              <ns0:jc ns0:val="left"/>
               <ns0:autoSpaceDE ns0:val="0"/>
               <ns0:autoSpaceDN ns0:val="0"/>
               <ns0:adjustRightInd ns0:val="0"/>
@@ -5378,6 +5395,7 @@
           </ns0:tcPr>
           <ns0:p ns2:paraId="20BB0DBD" ns2:textId="77777777" ns0:rsidR="00AD6593" ns0:rsidRPr="004C3CB1" ns0:rsidRDefault="00AD6593" ns0:rsidP="00AA3A7E">
             <ns0:pPr>
+              <ns0:jc ns0:val="left"/>
               <ns0:autoSpaceDE ns0:val="0"/>
               <ns0:autoSpaceDN ns0:val="0"/>
               <ns0:adjustRightInd ns0:val="0"/>
@@ -5404,6 +5422,7 @@
           </ns0:tcPr>
           <ns0:p ns2:paraId="430ADEFB" ns2:textId="77777777" ns0:rsidR="00AD6593" ns0:rsidRPr="004C3CB1" ns0:rsidRDefault="00AD6593" ns0:rsidP="00AA3A7E">
             <ns0:pPr>
+              <ns0:jc ns0:val="left"/>
               <ns0:autoSpaceDE ns0:val="0"/>
               <ns0:autoSpaceDN ns0:val="0"/>
               <ns0:adjustRightInd ns0:val="0"/>
@@ -5471,6 +5490,7 @@
           </ns0:tcPr>
           <ns0:p ns2:paraId="32407576" ns2:textId="77777777" ns0:rsidR="00AD6593" ns0:rsidRPr="004C3CB1" ns0:rsidRDefault="00AD6593" ns0:rsidP="00AA3A7E">
             <ns0:pPr>
+              <ns0:jc ns0:val="left"/>
               <ns0:autoSpaceDE ns0:val="0"/>
               <ns0:autoSpaceDN ns0:val="0"/>
               <ns0:adjustRightInd ns0:val="0"/>
@@ -5496,6 +5516,7 @@
           </ns0:tcPr>
           <ns0:p ns2:paraId="6DE6FB18" ns2:textId="77777777" ns0:rsidR="00AD6593" ns0:rsidRPr="004C3CB1" ns0:rsidRDefault="00AD6593" ns0:rsidP="00AA3A7E">
             <ns0:pPr>
+              <ns0:jc ns0:val="left"/>
               <ns0:autoSpaceDE ns0:val="0"/>
               <ns0:autoSpaceDN ns0:val="0"/>
               <ns0:adjustRightInd ns0:val="0"/>
@@ -5564,6 +5585,7 @@
           </ns0:tcPr>
           <ns0:p ns2:paraId="74569C77" ns2:textId="77777777" ns0:rsidR="00AD6593" ns0:rsidRPr="004C3CB1" ns0:rsidRDefault="00AD6593" ns0:rsidP="00AA3A7E">
             <ns0:pPr>
+              <ns0:jc ns0:val="left"/>
               <ns0:autoSpaceDE ns0:val="0"/>
               <ns0:autoSpaceDN ns0:val="0"/>
               <ns0:adjustRightInd ns0:val="0"/>
@@ -5590,6 +5612,7 @@
           </ns0:tcPr>
           <ns0:p ns2:paraId="39BD6B8E" ns2:textId="77777777" ns0:rsidR="00AD6593" ns0:rsidRPr="004C3CB1" ns0:rsidRDefault="00AD6593" ns0:rsidP="00AA3A7E">
             <ns0:pPr>
+              <ns0:jc ns0:val="left"/>
               <ns0:autoSpaceDE ns0:val="0"/>
               <ns0:autoSpaceDN ns0:val="0"/>
               <ns0:adjustRightInd ns0:val="0"/>
@@ -5656,6 +5679,7 @@
           </ns0:tcPr>
           <ns0:p ns2:paraId="11B76974" ns2:textId="77777777" ns0:rsidR="00AD6593" ns0:rsidRPr="004C3CB1" ns0:rsidRDefault="00AD6593" ns0:rsidP="00AA3A7E">
             <ns0:pPr>
+              <ns0:jc ns0:val="left"/>
               <ns0:autoSpaceDE ns0:val="0"/>
               <ns0:autoSpaceDN ns0:val="0"/>
               <ns0:adjustRightInd ns0:val="0"/>
@@ -5712,6 +5736,7 @@
           </ns0:tcPr>
           <ns0:p ns2:paraId="5FE4F1E4" ns2:textId="77777777" ns0:rsidR="00AD6593" ns0:rsidRPr="004C3CB1" ns0:rsidRDefault="00ED667D" ns0:rsidP="00AA3A7E">
             <ns0:pPr>
+              <ns0:jc ns0:val="left"/>
               <ns0:autoSpaceDE ns0:val="0"/>
               <ns0:autoSpaceDN ns0:val="0"/>
               <ns0:adjustRightInd ns0:val="0"/>
@@ -5756,6 +5781,7 @@
           </ns0:tcPr>
           <ns0:p ns2:paraId="6D208F1E" ns2:textId="77777777" ns0:rsidR="00AD6593" ns0:rsidRPr="004C3CB1" ns0:rsidRDefault="00AD6593" ns0:rsidP="00AA3A7E">
             <ns0:pPr>
+              <ns0:jc ns0:val="left"/>
               <ns0:autoSpaceDE ns0:val="0"/>
               <ns0:autoSpaceDN ns0:val="0"/>
               <ns0:adjustRightInd ns0:val="0"/>
@@ -5781,6 +5807,7 @@
           </ns0:tcPr>
           <ns0:p ns2:paraId="151F6331" ns2:textId="77777777" ns0:rsidR="00AD6593" ns0:rsidRPr="004C3CB1" ns0:rsidRDefault="00ED667D" ns0:rsidP="00AA3A7E">
             <ns0:pPr>
+              <ns0:jc ns0:val="left"/>
               <ns0:autoSpaceDE ns0:val="0"/>
               <ns0:autoSpaceDN ns0:val="0"/>
               <ns0:adjustRightInd ns0:val="0"/>
@@ -5820,6 +5847,7 @@
           </ns0:tcPr>
           <ns0:p ns2:paraId="0D6C050D" ns2:textId="77777777" ns0:rsidR="00AD6593" ns0:rsidRPr="004C3CB1" ns0:rsidRDefault="00ED667D" ns0:rsidP="00AA3A7E">
             <ns0:pPr>
+              <ns0:jc ns0:val="left"/>
               <ns0:autoSpaceDE ns0:val="0"/>
               <ns0:autoSpaceDN ns0:val="0"/>
               <ns0:adjustRightInd ns0:val="0"/>
@@ -5855,6 +5883,7 @@
           </ns0:tcPr>
           <ns0:p ns2:paraId="040A6DE9" ns2:textId="77777777" ns0:rsidR="00AD6593" ns0:rsidRPr="004C3CB1" ns0:rsidRDefault="00AD6593" ns0:rsidP="00AA3A7E">
             <ns0:pPr>
+              <ns0:jc ns0:val="left"/>
               <ns0:autoSpaceDE ns0:val="0"/>
               <ns0:autoSpaceDN ns0:val="0"/>
               <ns0:adjustRightInd ns0:val="0"/>
@@ -5880,6 +5909,7 @@
           </ns0:tcPr>
           <ns0:p ns2:paraId="1F27413D" ns2:textId="77777777" ns0:rsidR="00AD6593" ns0:rsidRPr="004C3CB1" ns0:rsidRDefault="00ED667D" ns0:rsidP="00AA3A7E">
             <ns0:pPr>
+              <ns0:jc ns0:val="left"/>
               <ns0:autoSpaceDE ns0:val="0"/>
               <ns0:autoSpaceDN ns0:val="0"/>
               <ns0:adjustRightInd ns0:val="0"/>

</xml_diff>